<commit_message>
Update resumes: Skills first, Education second, I want to summary
</commit_message>
<xml_diff>
--- a/assets/resumes/Ayomide_Ajibola_Bioinformatics_Resume.docx
+++ b/assets/resumes/Ayomide_Ajibola_Bioinformatics_Resume.docx
@@ -4,7 +4,7 @@
   <w:body>
     <w:p>
       <w:pPr>
-        <w:spacing w:before="0" w:after="40"/>
+        <w:spacing w:before="0" w:after="20"/>
         <w:jc w:val="center"/>
       </w:pPr>
       <w:r>
@@ -12,7 +12,7 @@
           <w:rFonts w:ascii="Calibri" w:hAnsi="Calibri"/>
           <w:b/>
           <w:color w:val="182B49"/>
-          <w:sz w:val="34"/>
+          <w:sz w:val="33"/>
         </w:rPr>
         <w:t>AYOMIDE AJIBOLA</w:t>
       </w:r>
@@ -26,21 +26,21 @@
         <w:rPr>
           <w:rFonts w:ascii="Calibri" w:hAnsi="Calibri"/>
           <w:color w:val="323232"/>
-          <w:sz w:val="19"/>
+          <w:sz w:val="18"/>
         </w:rPr>
         <w:t>Irvington, NJ | (443) 561-7501 | aajibolajabell@gmail.com | Authorized to work in the U.S.</w:t>
       </w:r>
     </w:p>
     <w:p>
       <w:pPr>
-        <w:spacing w:before="0" w:after="120"/>
+        <w:spacing w:before="0" w:after="80"/>
         <w:jc w:val="center"/>
       </w:pPr>
       <w:r>
         <w:rPr>
           <w:rFonts w:ascii="Calibri" w:hAnsi="Calibri"/>
           <w:color w:val="3C3C3C"/>
-          <w:sz w:val="19"/>
+          <w:sz w:val="18"/>
         </w:rPr>
         <w:t>LinkedIn: linkedin.com/in/ayomide-a-70396319b | GitHub: github.com/ayomide-ajibola | GPA: 3.5 / 4.0</w:t>
       </w:r>
@@ -48,9 +48,9 @@
     <w:p>
       <w:pPr>
         <w:keepNext/>
-        <w:spacing w:before="120" w:after="60"/>
+        <w:spacing w:before="100" w:after="40"/>
         <w:pBdr>
-          <w:bottom w:val="single" w:sz="8" w:space="1" w:color="182B49"/>
+          <w:bottom w:val="single" w:sz="6" w:space="1" w:color="182B49"/>
         </w:pBdr>
       </w:pPr>
       <w:r>
@@ -58,29 +58,29 @@
           <w:rFonts w:ascii="Calibri" w:hAnsi="Calibri"/>
           <w:b/>
           <w:color w:val="182B49"/>
-          <w:sz w:val="22"/>
+          <w:sz w:val="21"/>
         </w:rPr>
         <w:t>PROFESSIONAL SUMMARY</w:t>
       </w:r>
     </w:p>
     <w:p>
       <w:pPr>
-        <w:spacing w:before="20" w:after="40" w:line="264" w:lineRule="auto"/>
+        <w:spacing w:before="20" w:after="40" w:line="254" w:lineRule="auto"/>
       </w:pPr>
       <w:r>
         <w:rPr>
           <w:rFonts w:ascii="Calibri" w:hAnsi="Calibri"/>
-          <w:sz w:val="19"/>
+          <w:sz w:val="18"/>
         </w:rPr>
-        <w:t>Computational Biologist and M.S. Candidate in Computational Science &amp; Engineering with proven expertise in Next-Generation Sequencing (NGS) data pipelines, sequence alignment, genomic quality control, and biomedical signal modeling. Proficient in Linux/WSL environments utilizing FastQC, fastp, Trimmomatic, BWA-MEM, Bowtie2, Samtools, and IGV, alongside Python (BioPython, NumPy, Pandas) and automated Bash workflows. Experienced handling 19.6M+ paired-end sequencing reads, architecting reproducible bioinformatics workflows with MD5 checksum verification, and applying machine learning to complex biological datasets.</w:t>
+        <w:t>I want to leverage my accelerated dual-degree background in Computational Science &amp; Engineering (B.S. &amp; M.S., 3.5 GPA) to break into the bioinformatics and computational biology industry as an entry-level Bioinformatics Analyst, NGS Specialist, or Scientific Programmer. Experienced in building reproducible Next-Generation Sequencing (NGS) pipelines, sequence alignment, genomic quality control, and biomedical signal modeling across Linux/WSL environments utilizing FastQC, fastp, Trimmomatic, BWA-MEM, Bowtie2, Samtools, and IGV, alongside Python (BioPython, NumPy, Pandas) and automated Bash workflows.</w:t>
       </w:r>
     </w:p>
     <w:p>
       <w:pPr>
         <w:keepNext/>
-        <w:spacing w:before="120" w:after="60"/>
+        <w:spacing w:before="100" w:after="40"/>
         <w:pBdr>
-          <w:bottom w:val="single" w:sz="8" w:space="1" w:color="182B49"/>
+          <w:bottom w:val="single" w:sz="6" w:space="1" w:color="182B49"/>
         </w:pBdr>
       </w:pPr>
       <w:r>
@@ -88,9 +88,79 @@
           <w:rFonts w:ascii="Calibri" w:hAnsi="Calibri"/>
           <w:b/>
           <w:color w:val="182B49"/>
-          <w:sz w:val="22"/>
+          <w:sz w:val="21"/>
         </w:rPr>
-        <w:t>EDUCATION</w:t>
+        <w:t>TECHNICAL SKILLS &amp; COMPETENCIES</w:t>
+      </w:r>
+    </w:p>
+    <w:p>
+      <w:pPr>
+        <w:pStyle w:val="ListBullet"/>
+        <w:spacing w:before="0" w:after="20" w:line="252" w:lineRule="auto"/>
+      </w:pPr>
+      <w:r>
+        <w:rPr>
+          <w:rFonts w:ascii="Calibri" w:hAnsi="Calibri"/>
+          <w:sz w:val="18"/>
+        </w:rPr>
+        <w:t>Bioinformatics &amp; NGS Tools: FastQC, fastp, Trimmomatic, MultiQC, BWA-MEM, Bowtie2, Samtools (fixmate, sort, markdup, index), IGV (Integrative Genomics Viewer), FASTX-Toolkit.</w:t>
+      </w:r>
+    </w:p>
+    <w:p>
+      <w:pPr>
+        <w:pStyle w:val="ListBullet"/>
+        <w:spacing w:before="0" w:after="20" w:line="252" w:lineRule="auto"/>
+      </w:pPr>
+      <w:r>
+        <w:rPr>
+          <w:rFonts w:ascii="Calibri" w:hAnsi="Calibri"/>
+          <w:sz w:val="18"/>
+        </w:rPr>
+        <w:t>Genomic Data &amp; Formats: FASTQ, FASTA, SAM, BAM, BAI, VCF, GTF/GFF, NCBI SRA / E-utilities, Ensembl, Reference Genomes (E. coli K-12, Human GRCh38).</w:t>
+      </w:r>
+    </w:p>
+    <w:p>
+      <w:pPr>
+        <w:pStyle w:val="ListBullet"/>
+        <w:spacing w:before="0" w:after="20" w:line="252" w:lineRule="auto"/>
+      </w:pPr>
+      <w:r>
+        <w:rPr>
+          <w:rFonts w:ascii="Calibri" w:hAnsi="Calibri"/>
+          <w:sz w:val="18"/>
+        </w:rPr>
+        <w:t>Programming &amp; Computation: Python (BioPython, Pandas, NumPy, SciPy, Matplotlib), Bash/Shell Scripting, R, MATLAB, SQL (PostgreSQL, MySQL), C/C++.</w:t>
+      </w:r>
+    </w:p>
+    <w:p>
+      <w:pPr>
+        <w:pStyle w:val="ListBullet"/>
+        <w:spacing w:before="0" w:after="20" w:line="252" w:lineRule="auto"/>
+      </w:pPr>
+      <w:r>
+        <w:rPr>
+          <w:rFonts w:ascii="Calibri" w:hAnsi="Calibri"/>
+          <w:sz w:val="18"/>
+        </w:rPr>
+        <w:t>Workflow &amp; Environment: Linux/Ubuntu (WSL), High-Performance Computing (HPC), Git, GitHub Actions (CI/CD), Docker basics, Automated MD5 Manifests.</w:t>
+      </w:r>
+    </w:p>
+    <w:p>
+      <w:pPr>
+        <w:keepNext/>
+        <w:spacing w:before="100" w:after="40"/>
+        <w:pBdr>
+          <w:bottom w:val="single" w:sz="6" w:space="1" w:color="182B49"/>
+        </w:pBdr>
+      </w:pPr>
+      <w:r>
+        <w:rPr>
+          <w:rFonts w:ascii="Calibri" w:hAnsi="Calibri"/>
+          <w:b/>
+          <w:color w:val="182B49"/>
+          <w:sz w:val="21"/>
+        </w:rPr>
+        <w:t>EDUCATION &amp; ACADEMIC FOUNDATIONS</w:t>
       </w:r>
     </w:p>
     <w:tbl>
@@ -101,13 +171,13 @@
         <w:tblLook w:firstColumn="1" w:firstRow="1" w:lastColumn="0" w:lastRow="0" w:noHBand="0" w:noVBand="1" w:val="04A0"/>
       </w:tblPr>
       <w:tblGrid>
-        <w:gridCol w:w="7488"/>
-        <w:gridCol w:w="2880"/>
+        <w:gridCol w:w="7632"/>
+        <w:gridCol w:w="3024"/>
       </w:tblGrid>
       <w:tr>
         <w:tc>
           <w:tcPr>
-            <w:tcW w:type="dxa" w:w="5184"/>
+            <w:tcW w:type="dxa" w:w="5328"/>
             <w:tcMar>
               <w:top w:w="0" w:type="dxa"/>
               <w:bottom w:w="0" w:type="dxa"/>
@@ -118,13 +188,13 @@
           <w:p>
             <w:pPr>
               <w:keepNext/>
-              <w:spacing w:before="60" w:after="20"/>
+              <w:spacing w:before="40" w:after="10"/>
             </w:pPr>
             <w:r>
               <w:rPr>
                 <w:rFonts w:ascii="Calibri" w:hAnsi="Calibri"/>
                 <w:b/>
-                <w:sz w:val="20"/>
+                <w:sz w:val="19"/>
               </w:rPr>
               <w:t>Master of Science in Computational Science &amp; Engineering</w:t>
             </w:r>
@@ -132,7 +202,7 @@
               <w:rPr>
                 <w:rFonts w:ascii="Calibri" w:hAnsi="Calibri"/>
                 <w:i/>
-                <w:sz w:val="20"/>
+                <w:sz w:val="19"/>
               </w:rPr>
               <w:t xml:space="preserve"> | Kean University</w:t>
             </w:r>
@@ -140,7 +210,7 @@
         </w:tc>
         <w:tc>
           <w:tcPr>
-            <w:tcW w:type="dxa" w:w="5184"/>
+            <w:tcW w:type="dxa" w:w="5328"/>
             <w:tcMar>
               <w:top w:w="0" w:type="dxa"/>
               <w:bottom w:w="0" w:type="dxa"/>
@@ -151,16 +221,16 @@
           <w:p>
             <w:pPr>
               <w:keepNext/>
-              <w:spacing w:before="60" w:after="20"/>
+              <w:spacing w:before="40" w:after="10"/>
               <w:jc w:val="right"/>
             </w:pPr>
             <w:r>
               <w:rPr>
                 <w:rFonts w:ascii="Calibri" w:hAnsi="Calibri"/>
                 <w:color w:val="464646"/>
-                <w:sz w:val="19"/>
+                <w:sz w:val="18"/>
               </w:rPr>
-              <w:t>Union, NJ | Expected May 2026</w:t>
+              <w:t>Union, NJ | May 2026</w:t>
             </w:r>
           </w:p>
         </w:tc>
@@ -169,25 +239,25 @@
     <w:p>
       <w:pPr>
         <w:pStyle w:val="ListBullet"/>
-        <w:spacing w:before="0" w:after="30" w:line="259" w:lineRule="auto"/>
+        <w:spacing w:before="0" w:after="20" w:line="252" w:lineRule="auto"/>
       </w:pPr>
       <w:r>
         <w:rPr>
           <w:rFonts w:ascii="Calibri" w:hAnsi="Calibri"/>
-          <w:sz w:val="19"/>
+          <w:sz w:val="18"/>
         </w:rPr>
-        <w:t>GPA: 3.5/4.0 | Focus: Computational Biology, High-Performance Computing, Bioinformatics Algorithms, Machine Learning &amp; Mathematical Modeling.</w:t>
+        <w:t>Cumulative GPA: 3.5 / 4.0 | Academic Focus: Computational Biology, Bioinformatics Algorithms, High-Performance Computing, Database Systems, Dynamical Systems.</w:t>
       </w:r>
     </w:p>
     <w:p>
       <w:pPr>
         <w:pStyle w:val="ListBullet"/>
-        <w:spacing w:before="0" w:after="30" w:line="259" w:lineRule="auto"/>
+        <w:spacing w:before="0" w:after="20" w:line="252" w:lineRule="auto"/>
       </w:pPr>
       <w:r>
         <w:rPr>
           <w:rFonts w:ascii="Calibri" w:hAnsi="Calibri"/>
-          <w:sz w:val="19"/>
+          <w:sz w:val="18"/>
         </w:rPr>
         <w:t>Master's Thesis: "Using LLMs and Machine Learning to Auto-Label and Summarize Wearable Sensing Logs for Continuous Health Monitoring" (Advisor: Dr. Bin Hu).</w:t>
       </w:r>
@@ -200,13 +270,13 @@
         <w:tblLook w:firstColumn="1" w:firstRow="1" w:lastColumn="0" w:lastRow="0" w:noHBand="0" w:noVBand="1" w:val="04A0"/>
       </w:tblPr>
       <w:tblGrid>
-        <w:gridCol w:w="7488"/>
-        <w:gridCol w:w="2880"/>
+        <w:gridCol w:w="7632"/>
+        <w:gridCol w:w="3024"/>
       </w:tblGrid>
       <w:tr>
         <w:tc>
           <w:tcPr>
-            <w:tcW w:type="dxa" w:w="5184"/>
+            <w:tcW w:type="dxa" w:w="5328"/>
             <w:tcMar>
               <w:top w:w="0" w:type="dxa"/>
               <w:bottom w:w="0" w:type="dxa"/>
@@ -217,13 +287,13 @@
           <w:p>
             <w:pPr>
               <w:keepNext/>
-              <w:spacing w:before="60" w:after="20"/>
+              <w:spacing w:before="40" w:after="10"/>
             </w:pPr>
             <w:r>
               <w:rPr>
                 <w:rFonts w:ascii="Calibri" w:hAnsi="Calibri"/>
                 <w:b/>
-                <w:sz w:val="20"/>
+                <w:sz w:val="19"/>
               </w:rPr>
               <w:t>Bachelor of Science in Computational Science &amp; Engineering</w:t>
             </w:r>
@@ -231,7 +301,7 @@
               <w:rPr>
                 <w:rFonts w:ascii="Calibri" w:hAnsi="Calibri"/>
                 <w:i/>
-                <w:sz w:val="20"/>
+                <w:sz w:val="19"/>
               </w:rPr>
               <w:t xml:space="preserve"> | Kean University</w:t>
             </w:r>
@@ -239,7 +309,7 @@
         </w:tc>
         <w:tc>
           <w:tcPr>
-            <w:tcW w:type="dxa" w:w="5184"/>
+            <w:tcW w:type="dxa" w:w="5328"/>
             <w:tcMar>
               <w:top w:w="0" w:type="dxa"/>
               <w:bottom w:w="0" w:type="dxa"/>
@@ -250,14 +320,14 @@
           <w:p>
             <w:pPr>
               <w:keepNext/>
-              <w:spacing w:before="60" w:after="20"/>
+              <w:spacing w:before="40" w:after="10"/>
               <w:jc w:val="right"/>
             </w:pPr>
             <w:r>
               <w:rPr>
                 <w:rFonts w:ascii="Calibri" w:hAnsi="Calibri"/>
                 <w:color w:val="464646"/>
-                <w:sz w:val="19"/>
+                <w:sz w:val="18"/>
               </w:rPr>
               <w:t>Union, NJ | May 2025</w:t>
             </w:r>
@@ -268,22 +338,22 @@
     <w:p>
       <w:pPr>
         <w:pStyle w:val="ListBullet"/>
-        <w:spacing w:before="0" w:after="30" w:line="259" w:lineRule="auto"/>
+        <w:spacing w:before="0" w:after="20" w:line="252" w:lineRule="auto"/>
       </w:pPr>
       <w:r>
         <w:rPr>
           <w:rFonts w:ascii="Calibri" w:hAnsi="Calibri"/>
-          <w:sz w:val="19"/>
+          <w:sz w:val="18"/>
         </w:rPr>
-        <w:t>Relevant Coursework: Advanced Research in Data Science, Data Structures &amp; Algorithms, Artificial Intelligence, Database Management Systems, Differential Equations.</w:t>
+        <w:t>Relevant Coursework: Advanced Research in Data Science, Data Structures &amp; Algorithms, Artificial Intelligence, Computer Vision, Differential Equations.</w:t>
       </w:r>
     </w:p>
     <w:p>
       <w:pPr>
         <w:keepNext/>
-        <w:spacing w:before="120" w:after="60"/>
+        <w:spacing w:before="100" w:after="40"/>
         <w:pBdr>
-          <w:bottom w:val="single" w:sz="8" w:space="1" w:color="182B49"/>
+          <w:bottom w:val="single" w:sz="6" w:space="1" w:color="182B49"/>
         </w:pBdr>
       </w:pPr>
       <w:r>
@@ -291,457 +361,7 @@
           <w:rFonts w:ascii="Calibri" w:hAnsi="Calibri"/>
           <w:b/>
           <w:color w:val="182B49"/>
-          <w:sz w:val="22"/>
-        </w:rPr>
-        <w:t>TECHNICAL SKILLS</w:t>
-      </w:r>
-    </w:p>
-    <w:p>
-      <w:pPr>
-        <w:pStyle w:val="ListBullet"/>
-        <w:spacing w:before="0" w:after="30" w:line="259" w:lineRule="auto"/>
-      </w:pPr>
-      <w:r>
-        <w:rPr>
-          <w:rFonts w:ascii="Calibri" w:hAnsi="Calibri"/>
-          <w:sz w:val="19"/>
-        </w:rPr>
-        <w:t>Bioinformatics &amp; NGS Tools: FastQC, fastp, Trimmomatic, MultiQC, BWA-MEM, Bowtie2, Samtools (fixmate, sort, markdup, index), IGV (Integrative Genomics Viewer), FASTX-Toolkit.</w:t>
-      </w:r>
-    </w:p>
-    <w:p>
-      <w:pPr>
-        <w:pStyle w:val="ListBullet"/>
-        <w:spacing w:before="0" w:after="30" w:line="259" w:lineRule="auto"/>
-      </w:pPr>
-      <w:r>
-        <w:rPr>
-          <w:rFonts w:ascii="Calibri" w:hAnsi="Calibri"/>
-          <w:sz w:val="19"/>
-        </w:rPr>
-        <w:t>Genomic Formats &amp; Databases: FASTQ, FASTA, SAM, BAM, BAI, VCF, GTF, NCBI SRA / E-utilities, Ensembl, Reference Genomes (E. coli K-12, Human GRCh38).</w:t>
-      </w:r>
-    </w:p>
-    <w:p>
-      <w:pPr>
-        <w:pStyle w:val="ListBullet"/>
-        <w:spacing w:before="0" w:after="30" w:line="259" w:lineRule="auto"/>
-      </w:pPr>
-      <w:r>
-        <w:rPr>
-          <w:rFonts w:ascii="Calibri" w:hAnsi="Calibri"/>
-          <w:sz w:val="19"/>
-        </w:rPr>
-        <w:t>Languages &amp; Computation: Python (BioPython, Pandas, NumPy, SciPy, Matplotlib), Bash/Shell Scripting, R, MATLAB, SQL (PostgreSQL, MySQL), C/C++.</w:t>
-      </w:r>
-    </w:p>
-    <w:p>
-      <w:pPr>
-        <w:pStyle w:val="ListBullet"/>
-        <w:spacing w:before="0" w:after="30" w:line="259" w:lineRule="auto"/>
-      </w:pPr>
-      <w:r>
-        <w:rPr>
-          <w:rFonts w:ascii="Calibri" w:hAnsi="Calibri"/>
-          <w:sz w:val="19"/>
-        </w:rPr>
-        <w:t>Developer Tools &amp; Environment: Linux/Ubuntu (WSL), High-Performance Computing (HPC), Git, GitHub Actions, Docker basics, Automated Manifests &amp; MD5 Checksums.</w:t>
-      </w:r>
-    </w:p>
-    <w:p>
-      <w:pPr>
-        <w:keepNext/>
-        <w:spacing w:before="120" w:after="60"/>
-        <w:pBdr>
-          <w:bottom w:val="single" w:sz="8" w:space="1" w:color="182B49"/>
-        </w:pBdr>
-      </w:pPr>
-      <w:r>
-        <w:rPr>
-          <w:rFonts w:ascii="Calibri" w:hAnsi="Calibri"/>
-          <w:b/>
-          <w:color w:val="182B49"/>
-          <w:sz w:val="22"/>
-        </w:rPr>
-        <w:t>BIOINFORMATICS &amp; COMPUTATIONAL BIOLOGY PROJECTS</w:t>
-      </w:r>
-    </w:p>
-    <w:tbl>
-      <w:tblPr>
-        <w:tblW w:type="auto" w:w="0"/>
-        <w:jc w:val="center"/>
-        <w:tblLayout w:type="fixed"/>
-        <w:tblLook w:firstColumn="1" w:firstRow="1" w:lastColumn="0" w:lastRow="0" w:noHBand="0" w:noVBand="1" w:val="04A0"/>
-      </w:tblPr>
-      <w:tblGrid>
-        <w:gridCol w:w="7488"/>
-        <w:gridCol w:w="2880"/>
-      </w:tblGrid>
-      <w:tr>
-        <w:tc>
-          <w:tcPr>
-            <w:tcW w:type="dxa" w:w="5184"/>
-            <w:tcMar>
-              <w:top w:w="0" w:type="dxa"/>
-              <w:bottom w:w="0" w:type="dxa"/>
-              <w:left w:w="0" w:type="dxa"/>
-              <w:right w:w="0" w:type="dxa"/>
-            </w:tcMar>
-          </w:tcPr>
-          <w:p>
-            <w:pPr>
-              <w:keepNext/>
-              <w:spacing w:before="60" w:after="20"/>
-            </w:pPr>
-            <w:r>
-              <w:rPr>
-                <w:rFonts w:ascii="Calibri" w:hAnsi="Calibri"/>
-                <w:b/>
-                <w:sz w:val="20"/>
-              </w:rPr>
-              <w:t>NGS Read Preprocessing, Quality Control &amp; Trimming Pipeline</w:t>
-            </w:r>
-            <w:r>
-              <w:rPr>
-                <w:rFonts w:ascii="Calibri" w:hAnsi="Calibri"/>
-                <w:i/>
-                <w:sz w:val="20"/>
-              </w:rPr>
-              <w:t xml:space="preserve"> | Bash, fastp, Trimmomatic, FastQC, MultiQC</w:t>
-            </w:r>
-          </w:p>
-        </w:tc>
-        <w:tc>
-          <w:tcPr>
-            <w:tcW w:type="dxa" w:w="5184"/>
-            <w:tcMar>
-              <w:top w:w="0" w:type="dxa"/>
-              <w:bottom w:w="0" w:type="dxa"/>
-              <w:left w:w="0" w:type="dxa"/>
-              <w:right w:w="0" w:type="dxa"/>
-            </w:tcMar>
-          </w:tcPr>
-          <w:p>
-            <w:pPr>
-              <w:keepNext/>
-              <w:spacing w:before="60" w:after="20"/>
-              <w:jc w:val="right"/>
-            </w:pPr>
-            <w:r>
-              <w:rPr>
-                <w:rFonts w:ascii="Calibri" w:hAnsi="Calibri"/>
-                <w:color w:val="464646"/>
-                <w:sz w:val="19"/>
-              </w:rPr>
-              <w:t>2026</w:t>
-            </w:r>
-          </w:p>
-        </w:tc>
-      </w:tr>
-    </w:tbl>
-    <w:p>
-      <w:pPr>
-        <w:pStyle w:val="ListBullet"/>
-        <w:spacing w:before="0" w:after="30" w:line="259" w:lineRule="auto"/>
-      </w:pPr>
-      <w:r>
-        <w:rPr>
-          <w:rFonts w:ascii="Calibri" w:hAnsi="Calibri"/>
-          <w:sz w:val="19"/>
-        </w:rPr>
-        <w:t>Engineered an automated end-to-end QC and filtering pipeline in Linux for 19.6M+ raw paired-end sequencing reads (NCBI SRA SRR2061397 &amp; SRR2061398).</w:t>
-      </w:r>
-    </w:p>
-    <w:p>
-      <w:pPr>
-        <w:pStyle w:val="ListBullet"/>
-        <w:spacing w:before="0" w:after="30" w:line="259" w:lineRule="auto"/>
-      </w:pPr>
-      <w:r>
-        <w:rPr>
-          <w:rFonts w:ascii="Calibri" w:hAnsi="Calibri"/>
-          <w:sz w:val="19"/>
-        </w:rPr>
-        <w:t>Executed pre- and post-filtering diagnostic assessments using FastQC and fastp; trimmed 160k+ adapter-contaminated reads and removed 4.2M low-quality bases.</w:t>
-      </w:r>
-    </w:p>
-    <w:p>
-      <w:pPr>
-        <w:pStyle w:val="ListBullet"/>
-        <w:spacing w:before="0" w:after="30" w:line="259" w:lineRule="auto"/>
-      </w:pPr>
-      <w:r>
-        <w:rPr>
-          <w:rFonts w:ascii="Calibri" w:hAnsi="Calibri"/>
-          <w:sz w:val="19"/>
-        </w:rPr>
-        <w:t>Elevated sequencing base fidelity from baseline to 98.8% Q20 and 95.1% Q30, while eliminating duplicate sequences down to a 3.3% duplicate rate.</w:t>
-      </w:r>
-    </w:p>
-    <w:p>
-      <w:pPr>
-        <w:pStyle w:val="ListBullet"/>
-        <w:spacing w:before="0" w:after="30" w:line="259" w:lineRule="auto"/>
-      </w:pPr>
-      <w:r>
-        <w:rPr>
-          <w:rFonts w:ascii="Calibri" w:hAnsi="Calibri"/>
-          <w:sz w:val="19"/>
-        </w:rPr>
-        <w:t>Aggregated multi-sample metrics into interactive diagnostic dashboards via MultiQC and created an automated audit script generating directory manifests with MD5 checksum verification to guarantee 100% reproducible workflows.</w:t>
-      </w:r>
-    </w:p>
-    <w:tbl>
-      <w:tblPr>
-        <w:tblW w:type="auto" w:w="0"/>
-        <w:jc w:val="center"/>
-        <w:tblLayout w:type="fixed"/>
-        <w:tblLook w:firstColumn="1" w:firstRow="1" w:lastColumn="0" w:lastRow="0" w:noHBand="0" w:noVBand="1" w:val="04A0"/>
-      </w:tblPr>
-      <w:tblGrid>
-        <w:gridCol w:w="7488"/>
-        <w:gridCol w:w="2880"/>
-      </w:tblGrid>
-      <w:tr>
-        <w:tc>
-          <w:tcPr>
-            <w:tcW w:type="dxa" w:w="5184"/>
-            <w:tcMar>
-              <w:top w:w="0" w:type="dxa"/>
-              <w:bottom w:w="0" w:type="dxa"/>
-              <w:left w:w="0" w:type="dxa"/>
-              <w:right w:w="0" w:type="dxa"/>
-            </w:tcMar>
-          </w:tcPr>
-          <w:p>
-            <w:pPr>
-              <w:keepNext/>
-              <w:spacing w:before="60" w:after="20"/>
-            </w:pPr>
-            <w:r>
-              <w:rPr>
-                <w:rFonts w:ascii="Calibri" w:hAnsi="Calibri"/>
-                <w:b/>
-                <w:sz w:val="20"/>
-              </w:rPr>
-              <w:t>Comparative Genome Alignment &amp; Sequence Processing Pipeline</w:t>
-            </w:r>
-            <w:r>
-              <w:rPr>
-                <w:rFonts w:ascii="Calibri" w:hAnsi="Calibri"/>
-                <w:i/>
-                <w:sz w:val="20"/>
-              </w:rPr>
-              <w:t xml:space="preserve"> | BWA-MEM, Bowtie2, Samtools, IGV, Bash</w:t>
-            </w:r>
-          </w:p>
-        </w:tc>
-        <w:tc>
-          <w:tcPr>
-            <w:tcW w:type="dxa" w:w="5184"/>
-            <w:tcMar>
-              <w:top w:w="0" w:type="dxa"/>
-              <w:bottom w:w="0" w:type="dxa"/>
-              <w:left w:w="0" w:type="dxa"/>
-              <w:right w:w="0" w:type="dxa"/>
-            </w:tcMar>
-          </w:tcPr>
-          <w:p>
-            <w:pPr>
-              <w:keepNext/>
-              <w:spacing w:before="60" w:after="20"/>
-              <w:jc w:val="right"/>
-            </w:pPr>
-            <w:r>
-              <w:rPr>
-                <w:rFonts w:ascii="Calibri" w:hAnsi="Calibri"/>
-                <w:color w:val="464646"/>
-                <w:sz w:val="19"/>
-              </w:rPr>
-              <w:t>2026</w:t>
-            </w:r>
-          </w:p>
-        </w:tc>
-      </w:tr>
-    </w:tbl>
-    <w:p>
-      <w:pPr>
-        <w:pStyle w:val="ListBullet"/>
-        <w:spacing w:before="0" w:after="30" w:line="259" w:lineRule="auto"/>
-      </w:pPr>
-      <w:r>
-        <w:rPr>
-          <w:rFonts w:ascii="Calibri" w:hAnsi="Calibri"/>
-          <w:sz w:val="19"/>
-        </w:rPr>
-        <w:t>Constructed high-throughput genomic alignment pipelines mapping Illumina paired-end reads (GA2) to the E. coli K-12 MG1655 reference genome.</w:t>
-      </w:r>
-    </w:p>
-    <w:p>
-      <w:pPr>
-        <w:pStyle w:val="ListBullet"/>
-        <w:spacing w:before="0" w:after="30" w:line="259" w:lineRule="auto"/>
-      </w:pPr>
-      <w:r>
-        <w:rPr>
-          <w:rFonts w:ascii="Calibri" w:hAnsi="Calibri"/>
-          <w:sz w:val="19"/>
-        </w:rPr>
-        <w:t>Benchmarked indexing and alignment performance between BWA-MEM and Bowtie2, systematically converting multi-gigabyte SAM alignments into compressed, coordinate-sorted BAM files.</w:t>
-      </w:r>
-    </w:p>
-    <w:p>
-      <w:pPr>
-        <w:pStyle w:val="ListBullet"/>
-        <w:spacing w:before="0" w:after="30" w:line="259" w:lineRule="auto"/>
-      </w:pPr>
-      <w:r>
-        <w:rPr>
-          <w:rFonts w:ascii="Calibri" w:hAnsi="Calibri"/>
-          <w:sz w:val="19"/>
-        </w:rPr>
-        <w:t>Utilized Samtools suite to execute mate-pair synchronization (fixmate), coordinate sorting, optical/PCR duplicate removal (markdup), and BAM index creation (bai).</w:t>
-      </w:r>
-    </w:p>
-    <w:p>
-      <w:pPr>
-        <w:pStyle w:val="ListBullet"/>
-        <w:spacing w:before="0" w:after="30" w:line="259" w:lineRule="auto"/>
-      </w:pPr>
-      <w:r>
-        <w:rPr>
-          <w:rFonts w:ascii="Calibri" w:hAnsi="Calibri"/>
-          <w:sz w:val="19"/>
-        </w:rPr>
-        <w:t>Inspected genomic read depths, mapping quality scores (MAPQ), and structural variants across chromosome loci using the Integrative Genomics Viewer (IGV).</w:t>
-      </w:r>
-    </w:p>
-    <w:tbl>
-      <w:tblPr>
-        <w:tblW w:type="auto" w:w="0"/>
-        <w:jc w:val="center"/>
-        <w:tblLayout w:type="fixed"/>
-        <w:tblLook w:firstColumn="1" w:firstRow="1" w:lastColumn="0" w:lastRow="0" w:noHBand="0" w:noVBand="1" w:val="04A0"/>
-      </w:tblPr>
-      <w:tblGrid>
-        <w:gridCol w:w="7488"/>
-        <w:gridCol w:w="2880"/>
-      </w:tblGrid>
-      <w:tr>
-        <w:tc>
-          <w:tcPr>
-            <w:tcW w:type="dxa" w:w="5184"/>
-            <w:tcMar>
-              <w:top w:w="0" w:type="dxa"/>
-              <w:bottom w:w="0" w:type="dxa"/>
-              <w:left w:w="0" w:type="dxa"/>
-              <w:right w:w="0" w:type="dxa"/>
-            </w:tcMar>
-          </w:tcPr>
-          <w:p>
-            <w:pPr>
-              <w:keepNext/>
-              <w:spacing w:before="60" w:after="20"/>
-            </w:pPr>
-            <w:r>
-              <w:rPr>
-                <w:rFonts w:ascii="Calibri" w:hAnsi="Calibri"/>
-                <w:b/>
-                <w:sz w:val="20"/>
-              </w:rPr>
-              <w:t>Biomedical Sensor Analytics &amp; Health Narrative Generation (Master's Thesis)</w:t>
-            </w:r>
-            <w:r>
-              <w:rPr>
-                <w:rFonts w:ascii="Calibri" w:hAnsi="Calibri"/>
-                <w:i/>
-                <w:sz w:val="20"/>
-              </w:rPr>
-              <w:t xml:space="preserve"> | PyTorch, scikit-learn, HuggingFace, Python</w:t>
-            </w:r>
-          </w:p>
-        </w:tc>
-        <w:tc>
-          <w:tcPr>
-            <w:tcW w:type="dxa" w:w="5184"/>
-            <w:tcMar>
-              <w:top w:w="0" w:type="dxa"/>
-              <w:bottom w:w="0" w:type="dxa"/>
-              <w:left w:w="0" w:type="dxa"/>
-              <w:right w:w="0" w:type="dxa"/>
-            </w:tcMar>
-          </w:tcPr>
-          <w:p>
-            <w:pPr>
-              <w:keepNext/>
-              <w:spacing w:before="60" w:after="20"/>
-              <w:jc w:val="right"/>
-            </w:pPr>
-            <w:r>
-              <w:rPr>
-                <w:rFonts w:ascii="Calibri" w:hAnsi="Calibri"/>
-                <w:color w:val="464646"/>
-                <w:sz w:val="19"/>
-              </w:rPr>
-              <w:t>2025 – 2026</w:t>
-            </w:r>
-          </w:p>
-        </w:tc>
-      </w:tr>
-    </w:tbl>
-    <w:p>
-      <w:pPr>
-        <w:pStyle w:val="ListBullet"/>
-        <w:spacing w:before="0" w:after="30" w:line="259" w:lineRule="auto"/>
-      </w:pPr>
-      <w:r>
-        <w:rPr>
-          <w:rFonts w:ascii="Calibri" w:hAnsi="Calibri"/>
-          <w:sz w:val="19"/>
-        </w:rPr>
-        <w:t>Processed 720k+ time-series IMU physiological records from clinical cohorts to classify activities and automate continuous health summaries.</w:t>
-      </w:r>
-    </w:p>
-    <w:p>
-      <w:pPr>
-        <w:pStyle w:val="ListBullet"/>
-        <w:spacing w:before="0" w:after="30" w:line="259" w:lineRule="auto"/>
-      </w:pPr>
-      <w:r>
-        <w:rPr>
-          <w:rFonts w:ascii="Calibri" w:hAnsi="Calibri"/>
-          <w:sz w:val="19"/>
-        </w:rPr>
-        <w:t>Extracted sliding-window statistical features across 3-axis sensors and constructed an SVM + few-shot LLM ensemble achieving 96% diagnostic accuracy.</w:t>
-      </w:r>
-    </w:p>
-    <w:p>
-      <w:pPr>
-        <w:pStyle w:val="ListBullet"/>
-        <w:spacing w:before="0" w:after="30" w:line="259" w:lineRule="auto"/>
-      </w:pPr>
-      <w:r>
-        <w:rPr>
-          <w:rFonts w:ascii="Calibri" w:hAnsi="Calibri"/>
-          <w:sz w:val="19"/>
-        </w:rPr>
-        <w:t>Automated clinical narrative summarization, transforming chronological sensor logs into human-readable behavioral reports for healthcare monitoring.</w:t>
-      </w:r>
-    </w:p>
-    <w:p>
-      <w:pPr>
-        <w:keepNext/>
-        <w:spacing w:before="120" w:after="60"/>
-        <w:pBdr>
-          <w:bottom w:val="single" w:sz="8" w:space="1" w:color="182B49"/>
-        </w:pBdr>
-      </w:pPr>
-      <w:r>
-        <w:rPr>
-          <w:rFonts w:ascii="Calibri" w:hAnsi="Calibri"/>
-          <w:b/>
-          <w:color w:val="182B49"/>
-          <w:sz w:val="22"/>
+          <w:sz w:val="21"/>
         </w:rPr>
         <w:t>PROFESSIONAL &amp; RESEARCH EXPERIENCE</w:t>
       </w:r>
@@ -754,13 +374,13 @@
         <w:tblLook w:firstColumn="1" w:firstRow="1" w:lastColumn="0" w:lastRow="0" w:noHBand="0" w:noVBand="1" w:val="04A0"/>
       </w:tblPr>
       <w:tblGrid>
-        <w:gridCol w:w="7488"/>
-        <w:gridCol w:w="2880"/>
+        <w:gridCol w:w="7632"/>
+        <w:gridCol w:w="3024"/>
       </w:tblGrid>
       <w:tr>
         <w:tc>
           <w:tcPr>
-            <w:tcW w:type="dxa" w:w="5184"/>
+            <w:tcW w:type="dxa" w:w="5328"/>
             <w:tcMar>
               <w:top w:w="0" w:type="dxa"/>
               <w:bottom w:w="0" w:type="dxa"/>
@@ -771,13 +391,13 @@
           <w:p>
             <w:pPr>
               <w:keepNext/>
-              <w:spacing w:before="60" w:after="20"/>
+              <w:spacing w:before="40" w:after="10"/>
             </w:pPr>
             <w:r>
               <w:rPr>
                 <w:rFonts w:ascii="Calibri" w:hAnsi="Calibri"/>
                 <w:b/>
-                <w:sz w:val="20"/>
+                <w:sz w:val="19"/>
               </w:rPr>
               <w:t>Student Research Assistant</w:t>
             </w:r>
@@ -785,7 +405,7 @@
               <w:rPr>
                 <w:rFonts w:ascii="Calibri" w:hAnsi="Calibri"/>
                 <w:i/>
-                <w:sz w:val="20"/>
+                <w:sz w:val="19"/>
               </w:rPr>
               <w:t xml:space="preserve"> | Kean University (GSSRP)</w:t>
             </w:r>
@@ -793,7 +413,7 @@
         </w:tc>
         <w:tc>
           <w:tcPr>
-            <w:tcW w:type="dxa" w:w="5184"/>
+            <w:tcW w:type="dxa" w:w="5328"/>
             <w:tcMar>
               <w:top w:w="0" w:type="dxa"/>
               <w:bottom w:w="0" w:type="dxa"/>
@@ -804,14 +424,14 @@
           <w:p>
             <w:pPr>
               <w:keepNext/>
-              <w:spacing w:before="60" w:after="20"/>
+              <w:spacing w:before="40" w:after="10"/>
               <w:jc w:val="right"/>
             </w:pPr>
             <w:r>
               <w:rPr>
                 <w:rFonts w:ascii="Calibri" w:hAnsi="Calibri"/>
                 <w:color w:val="464646"/>
-                <w:sz w:val="19"/>
+                <w:sz w:val="18"/>
               </w:rPr>
               <w:t>Union, NJ | Jul 2024 – Aug 2024</w:t>
             </w:r>
@@ -822,12 +442,12 @@
     <w:p>
       <w:pPr>
         <w:pStyle w:val="ListBullet"/>
-        <w:spacing w:before="0" w:after="30" w:line="259" w:lineRule="auto"/>
+        <w:spacing w:before="0" w:after="20" w:line="252" w:lineRule="auto"/>
       </w:pPr>
       <w:r>
         <w:rPr>
           <w:rFonts w:ascii="Calibri" w:hAnsi="Calibri"/>
-          <w:sz w:val="19"/>
+          <w:sz w:val="18"/>
         </w:rPr>
         <w:t>Developed computational algorithms and scientific automation scripts in Python and MATLAB to model dynamical biological and physical systems.</w:t>
       </w:r>
@@ -835,14 +455,14 @@
     <w:p>
       <w:pPr>
         <w:pStyle w:val="ListBullet"/>
-        <w:spacing w:before="0" w:after="30" w:line="259" w:lineRule="auto"/>
+        <w:spacing w:before="0" w:after="20" w:line="252" w:lineRule="auto"/>
       </w:pPr>
       <w:r>
         <w:rPr>
           <w:rFonts w:ascii="Calibri" w:hAnsi="Calibri"/>
-          <w:sz w:val="19"/>
+          <w:sz w:val="18"/>
         </w:rPr>
-        <w:t>Automated multidimensional data cleaning and transformation workflows, accelerating research throughput and establishing reproducible project documentation.</w:t>
+        <w:t>Automated data transformation and analysis workflows, accelerating research throughput and establishing reproducible technical documentation.</w:t>
       </w:r>
     </w:p>
     <w:tbl>
@@ -853,13 +473,13 @@
         <w:tblLook w:firstColumn="1" w:firstRow="1" w:lastColumn="0" w:lastRow="0" w:noHBand="0" w:noVBand="1" w:val="04A0"/>
       </w:tblPr>
       <w:tblGrid>
-        <w:gridCol w:w="7488"/>
-        <w:gridCol w:w="2880"/>
+        <w:gridCol w:w="7632"/>
+        <w:gridCol w:w="3024"/>
       </w:tblGrid>
       <w:tr>
         <w:tc>
           <w:tcPr>
-            <w:tcW w:type="dxa" w:w="5184"/>
+            <w:tcW w:type="dxa" w:w="5328"/>
             <w:tcMar>
               <w:top w:w="0" w:type="dxa"/>
               <w:bottom w:w="0" w:type="dxa"/>
@@ -870,13 +490,13 @@
           <w:p>
             <w:pPr>
               <w:keepNext/>
-              <w:spacing w:before="60" w:after="20"/>
+              <w:spacing w:before="40" w:after="10"/>
             </w:pPr>
             <w:r>
               <w:rPr>
                 <w:rFonts w:ascii="Calibri" w:hAnsi="Calibri"/>
                 <w:b/>
-                <w:sz w:val="20"/>
+                <w:sz w:val="19"/>
               </w:rPr>
               <w:t>Software &amp; Systems Integration Intern</w:t>
             </w:r>
@@ -884,7 +504,7 @@
               <w:rPr>
                 <w:rFonts w:ascii="Calibri" w:hAnsi="Calibri"/>
                 <w:i/>
-                <w:sz w:val="20"/>
+                <w:sz w:val="19"/>
               </w:rPr>
               <w:t xml:space="preserve"> | ECI / KLA-Tencor Corporation</w:t>
             </w:r>
@@ -892,7 +512,7 @@
         </w:tc>
         <w:tc>
           <w:tcPr>
-            <w:tcW w:type="dxa" w:w="5184"/>
+            <w:tcW w:type="dxa" w:w="5328"/>
             <w:tcMar>
               <w:top w:w="0" w:type="dxa"/>
               <w:bottom w:w="0" w:type="dxa"/>
@@ -903,14 +523,14 @@
           <w:p>
             <w:pPr>
               <w:keepNext/>
-              <w:spacing w:before="60" w:after="20"/>
+              <w:spacing w:before="40" w:after="10"/>
               <w:jc w:val="right"/>
             </w:pPr>
             <w:r>
               <w:rPr>
                 <w:rFonts w:ascii="Calibri" w:hAnsi="Calibri"/>
                 <w:color w:val="464646"/>
-                <w:sz w:val="19"/>
+                <w:sz w:val="18"/>
               </w:rPr>
               <w:t>Totowa, NJ | Jun 2022 – Sep 2022</w:t>
             </w:r>
@@ -921,27 +541,40 @@
     <w:p>
       <w:pPr>
         <w:pStyle w:val="ListBullet"/>
-        <w:spacing w:before="0" w:after="30" w:line="259" w:lineRule="auto"/>
+        <w:spacing w:before="0" w:after="20" w:line="252" w:lineRule="auto"/>
       </w:pPr>
       <w:r>
         <w:rPr>
           <w:rFonts w:ascii="Calibri" w:hAnsi="Calibri"/>
-          <w:sz w:val="19"/>
+          <w:sz w:val="18"/>
         </w:rPr>
-        <w:t>Configured and tested prototype inspection systems integrating physical hardware sensors with software data acquisition interfaces.</w:t>
+        <w:t>Configured and validated prototype semiconductor inspection systems integrating physical hardware sensors with software data acquisition controllers.</w:t>
       </w:r>
     </w:p>
     <w:p>
       <w:pPr>
         <w:pStyle w:val="ListBullet"/>
-        <w:spacing w:before="0" w:after="30" w:line="259" w:lineRule="auto"/>
+        <w:spacing w:before="0" w:after="20" w:line="252" w:lineRule="auto"/>
       </w:pPr>
       <w:r>
         <w:rPr>
           <w:rFonts w:ascii="Calibri" w:hAnsi="Calibri"/>
-          <w:sz w:val="19"/>
+          <w:sz w:val="18"/>
         </w:rPr>
-        <w:t>Authored Python and Bash test automation scripts, cutting manual QA data collection time by 30% and improving test reproducibility across Agile sprints.</w:t>
+        <w:t>Authored automated Python and Bash test scripts, reducing manual QA data collection time by 30% and improving test reproducibility across Agile sprints.</w:t>
+      </w:r>
+    </w:p>
+    <w:p>
+      <w:pPr>
+        <w:pStyle w:val="ListBullet"/>
+        <w:spacing w:before="0" w:after="20" w:line="252" w:lineRule="auto"/>
+      </w:pPr>
+      <w:r>
+        <w:rPr>
+          <w:rFonts w:ascii="Calibri" w:hAnsi="Calibri"/>
+          <w:sz w:val="18"/>
+        </w:rPr>
+        <w:t>Logged software defects in Jira and collaborated with senior engineering teams to validate firmware and software releases.</w:t>
       </w:r>
     </w:p>
     <w:tbl>
@@ -952,13 +585,13 @@
         <w:tblLook w:firstColumn="1" w:firstRow="1" w:lastColumn="0" w:lastRow="0" w:noHBand="0" w:noVBand="1" w:val="04A0"/>
       </w:tblPr>
       <w:tblGrid>
-        <w:gridCol w:w="7488"/>
-        <w:gridCol w:w="2880"/>
+        <w:gridCol w:w="7632"/>
+        <w:gridCol w:w="3024"/>
       </w:tblGrid>
       <w:tr>
         <w:tc>
           <w:tcPr>
-            <w:tcW w:type="dxa" w:w="5184"/>
+            <w:tcW w:type="dxa" w:w="5328"/>
             <w:tcMar>
               <w:top w:w="0" w:type="dxa"/>
               <w:bottom w:w="0" w:type="dxa"/>
@@ -969,13 +602,13 @@
           <w:p>
             <w:pPr>
               <w:keepNext/>
-              <w:spacing w:before="60" w:after="20"/>
+              <w:spacing w:before="40" w:after="10"/>
             </w:pPr>
             <w:r>
               <w:rPr>
                 <w:rFonts w:ascii="Calibri" w:hAnsi="Calibri"/>
                 <w:b/>
-                <w:sz w:val="20"/>
+                <w:sz w:val="19"/>
               </w:rPr>
               <w:t>Technical Support &amp; Peer Mentor</w:t>
             </w:r>
@@ -983,7 +616,7 @@
               <w:rPr>
                 <w:rFonts w:ascii="Calibri" w:hAnsi="Calibri"/>
                 <w:i/>
-                <w:sz w:val="20"/>
+                <w:sz w:val="19"/>
               </w:rPr>
               <w:t xml:space="preserve"> | College Steps</w:t>
             </w:r>
@@ -991,7 +624,7 @@
         </w:tc>
         <w:tc>
           <w:tcPr>
-            <w:tcW w:type="dxa" w:w="5184"/>
+            <w:tcW w:type="dxa" w:w="5328"/>
             <w:tcMar>
               <w:top w:w="0" w:type="dxa"/>
               <w:bottom w:w="0" w:type="dxa"/>
@@ -1002,14 +635,14 @@
           <w:p>
             <w:pPr>
               <w:keepNext/>
-              <w:spacing w:before="60" w:after="20"/>
+              <w:spacing w:before="40" w:after="10"/>
               <w:jc w:val="right"/>
             </w:pPr>
             <w:r>
               <w:rPr>
                 <w:rFonts w:ascii="Calibri" w:hAnsi="Calibri"/>
                 <w:color w:val="464646"/>
-                <w:sz w:val="19"/>
+                <w:sz w:val="18"/>
               </w:rPr>
               <w:t>Union, NJ | Oct 2022 – May 2025</w:t>
             </w:r>
@@ -1020,19 +653,295 @@
     <w:p>
       <w:pPr>
         <w:pStyle w:val="ListBullet"/>
-        <w:spacing w:before="0" w:after="30" w:line="259" w:lineRule="auto"/>
+        <w:spacing w:before="0" w:after="20" w:line="252" w:lineRule="auto"/>
       </w:pPr>
       <w:r>
         <w:rPr>
           <w:rFonts w:ascii="Calibri" w:hAnsi="Calibri"/>
-          <w:sz w:val="19"/>
+          <w:sz w:val="18"/>
         </w:rPr>
-        <w:t>Provided technical troubleshooting, software configuration, and digital onboarding for 15+ students utilizing digital learning and analysis tools.</w:t>
+        <w:t>Provided technical troubleshooting, software configuration, and digital onboarding for 15+ student users.</w:t>
+      </w:r>
+    </w:p>
+    <w:p>
+      <w:pPr>
+        <w:keepNext/>
+        <w:spacing w:before="100" w:after="40"/>
+        <w:pBdr>
+          <w:bottom w:val="single" w:sz="6" w:space="1" w:color="182B49"/>
+        </w:pBdr>
+      </w:pPr>
+      <w:r>
+        <w:rPr>
+          <w:rFonts w:ascii="Calibri" w:hAnsi="Calibri"/>
+          <w:b/>
+          <w:color w:val="182B49"/>
+          <w:sz w:val="21"/>
+        </w:rPr>
+        <w:t>FEATURED TECHNICAL PROJECTS</w:t>
+      </w:r>
+    </w:p>
+    <w:tbl>
+      <w:tblPr>
+        <w:tblW w:type="auto" w:w="0"/>
+        <w:jc w:val="center"/>
+        <w:tblLayout w:type="fixed"/>
+        <w:tblLook w:firstColumn="1" w:firstRow="1" w:lastColumn="0" w:lastRow="0" w:noHBand="0" w:noVBand="1" w:val="04A0"/>
+      </w:tblPr>
+      <w:tblGrid>
+        <w:gridCol w:w="7632"/>
+        <w:gridCol w:w="3024"/>
+      </w:tblGrid>
+      <w:tr>
+        <w:tc>
+          <w:tcPr>
+            <w:tcW w:type="dxa" w:w="5328"/>
+            <w:tcMar>
+              <w:top w:w="0" w:type="dxa"/>
+              <w:bottom w:w="0" w:type="dxa"/>
+              <w:left w:w="0" w:type="dxa"/>
+              <w:right w:w="0" w:type="dxa"/>
+            </w:tcMar>
+          </w:tcPr>
+          <w:p>
+            <w:pPr>
+              <w:keepNext/>
+              <w:spacing w:before="40" w:after="10"/>
+            </w:pPr>
+            <w:r>
+              <w:rPr>
+                <w:rFonts w:ascii="Calibri" w:hAnsi="Calibri"/>
+                <w:b/>
+                <w:sz w:val="19"/>
+              </w:rPr>
+              <w:t>NGS Read Preprocessing, Quality Control &amp; Trimming Pipeline</w:t>
+            </w:r>
+            <w:r>
+              <w:rPr>
+                <w:rFonts w:ascii="Calibri" w:hAnsi="Calibri"/>
+                <w:i/>
+                <w:sz w:val="19"/>
+              </w:rPr>
+              <w:t xml:space="preserve"> | Bash, fastp, FastQC, MultiQC</w:t>
+            </w:r>
+          </w:p>
+        </w:tc>
+        <w:tc>
+          <w:tcPr>
+            <w:tcW w:type="dxa" w:w="5328"/>
+            <w:tcMar>
+              <w:top w:w="0" w:type="dxa"/>
+              <w:bottom w:w="0" w:type="dxa"/>
+              <w:left w:w="0" w:type="dxa"/>
+              <w:right w:w="0" w:type="dxa"/>
+            </w:tcMar>
+          </w:tcPr>
+          <w:p>
+            <w:pPr>
+              <w:keepNext/>
+              <w:spacing w:before="40" w:after="10"/>
+              <w:jc w:val="right"/>
+            </w:pPr>
+            <w:r>
+              <w:rPr>
+                <w:rFonts w:ascii="Calibri" w:hAnsi="Calibri"/>
+                <w:color w:val="464646"/>
+                <w:sz w:val="18"/>
+              </w:rPr>
+              <w:t>2026</w:t>
+            </w:r>
+          </w:p>
+        </w:tc>
+      </w:tr>
+    </w:tbl>
+    <w:p>
+      <w:pPr>
+        <w:pStyle w:val="ListBullet"/>
+        <w:spacing w:before="0" w:after="20" w:line="252" w:lineRule="auto"/>
+      </w:pPr>
+      <w:r>
+        <w:rPr>
+          <w:rFonts w:ascii="Calibri" w:hAnsi="Calibri"/>
+          <w:sz w:val="18"/>
+        </w:rPr>
+        <w:t>Engineered an automated QC pipeline in Linux processing 19.6M+ paired-end sequencing reads (NCBI SRA SRR2061397 &amp; SRR2061398), elevating base quality to 98.8% Q20 / 95.1% Q30 and purging 4.2M contaminated adapter bases; generated MultiQC reports and automated MD5 audit manifests.</w:t>
+      </w:r>
+    </w:p>
+    <w:tbl>
+      <w:tblPr>
+        <w:tblW w:type="auto" w:w="0"/>
+        <w:jc w:val="center"/>
+        <w:tblLayout w:type="fixed"/>
+        <w:tblLook w:firstColumn="1" w:firstRow="1" w:lastColumn="0" w:lastRow="0" w:noHBand="0" w:noVBand="1" w:val="04A0"/>
+      </w:tblPr>
+      <w:tblGrid>
+        <w:gridCol w:w="7632"/>
+        <w:gridCol w:w="3024"/>
+      </w:tblGrid>
+      <w:tr>
+        <w:tc>
+          <w:tcPr>
+            <w:tcW w:type="dxa" w:w="5328"/>
+            <w:tcMar>
+              <w:top w:w="0" w:type="dxa"/>
+              <w:bottom w:w="0" w:type="dxa"/>
+              <w:left w:w="0" w:type="dxa"/>
+              <w:right w:w="0" w:type="dxa"/>
+            </w:tcMar>
+          </w:tcPr>
+          <w:p>
+            <w:pPr>
+              <w:keepNext/>
+              <w:spacing w:before="40" w:after="10"/>
+            </w:pPr>
+            <w:r>
+              <w:rPr>
+                <w:rFonts w:ascii="Calibri" w:hAnsi="Calibri"/>
+                <w:b/>
+                <w:sz w:val="19"/>
+              </w:rPr>
+              <w:t>Comparative Genome Alignment &amp; Sequence Processing Pipeline</w:t>
+            </w:r>
+            <w:r>
+              <w:rPr>
+                <w:rFonts w:ascii="Calibri" w:hAnsi="Calibri"/>
+                <w:i/>
+                <w:sz w:val="19"/>
+              </w:rPr>
+              <w:t xml:space="preserve"> | BWA-MEM, Bowtie2, Samtools, IGV</w:t>
+            </w:r>
+          </w:p>
+        </w:tc>
+        <w:tc>
+          <w:tcPr>
+            <w:tcW w:type="dxa" w:w="5328"/>
+            <w:tcMar>
+              <w:top w:w="0" w:type="dxa"/>
+              <w:bottom w:w="0" w:type="dxa"/>
+              <w:left w:w="0" w:type="dxa"/>
+              <w:right w:w="0" w:type="dxa"/>
+            </w:tcMar>
+          </w:tcPr>
+          <w:p>
+            <w:pPr>
+              <w:keepNext/>
+              <w:spacing w:before="40" w:after="10"/>
+              <w:jc w:val="right"/>
+            </w:pPr>
+            <w:r>
+              <w:rPr>
+                <w:rFonts w:ascii="Calibri" w:hAnsi="Calibri"/>
+                <w:color w:val="464646"/>
+                <w:sz w:val="18"/>
+              </w:rPr>
+              <w:t>2026</w:t>
+            </w:r>
+          </w:p>
+        </w:tc>
+      </w:tr>
+    </w:tbl>
+    <w:p>
+      <w:pPr>
+        <w:pStyle w:val="ListBullet"/>
+        <w:spacing w:before="0" w:after="20" w:line="252" w:lineRule="auto"/>
+      </w:pPr>
+      <w:r>
+        <w:rPr>
+          <w:rFonts w:ascii="Calibri" w:hAnsi="Calibri"/>
+          <w:sz w:val="18"/>
+        </w:rPr>
+        <w:t>Constructed high-throughput genomic alignment workflows mapping paired-end reads to the E. coli K-12 reference genome; converted SAM to sorted BAM, removed PCR duplicates via samtools markdup, indexed BAM files, and visually inspected alignment coverage in IGV.</w:t>
+      </w:r>
+    </w:p>
+    <w:tbl>
+      <w:tblPr>
+        <w:tblW w:type="auto" w:w="0"/>
+        <w:jc w:val="center"/>
+        <w:tblLayout w:type="fixed"/>
+        <w:tblLook w:firstColumn="1" w:firstRow="1" w:lastColumn="0" w:lastRow="0" w:noHBand="0" w:noVBand="1" w:val="04A0"/>
+      </w:tblPr>
+      <w:tblGrid>
+        <w:gridCol w:w="7632"/>
+        <w:gridCol w:w="3024"/>
+      </w:tblGrid>
+      <w:tr>
+        <w:tc>
+          <w:tcPr>
+            <w:tcW w:type="dxa" w:w="5328"/>
+            <w:tcMar>
+              <w:top w:w="0" w:type="dxa"/>
+              <w:bottom w:w="0" w:type="dxa"/>
+              <w:left w:w="0" w:type="dxa"/>
+              <w:right w:w="0" w:type="dxa"/>
+            </w:tcMar>
+          </w:tcPr>
+          <w:p>
+            <w:pPr>
+              <w:keepNext/>
+              <w:spacing w:before="40" w:after="10"/>
+            </w:pPr>
+            <w:r>
+              <w:rPr>
+                <w:rFonts w:ascii="Calibri" w:hAnsi="Calibri"/>
+                <w:b/>
+                <w:sz w:val="19"/>
+              </w:rPr>
+              <w:t>Biomedical Sensor Analytics &amp; Health Narrative Pipeline (Thesis)</w:t>
+            </w:r>
+            <w:r>
+              <w:rPr>
+                <w:rFonts w:ascii="Calibri" w:hAnsi="Calibri"/>
+                <w:i/>
+                <w:sz w:val="19"/>
+              </w:rPr>
+              <w:t xml:space="preserve"> | PyTorch, scikit-learn, HuggingFace</w:t>
+            </w:r>
+          </w:p>
+        </w:tc>
+        <w:tc>
+          <w:tcPr>
+            <w:tcW w:type="dxa" w:w="5328"/>
+            <w:tcMar>
+              <w:top w:w="0" w:type="dxa"/>
+              <w:bottom w:w="0" w:type="dxa"/>
+              <w:left w:w="0" w:type="dxa"/>
+              <w:right w:w="0" w:type="dxa"/>
+            </w:tcMar>
+          </w:tcPr>
+          <w:p>
+            <w:pPr>
+              <w:keepNext/>
+              <w:spacing w:before="40" w:after="10"/>
+              <w:jc w:val="right"/>
+            </w:pPr>
+            <w:r>
+              <w:rPr>
+                <w:rFonts w:ascii="Calibri" w:hAnsi="Calibri"/>
+                <w:color w:val="464646"/>
+                <w:sz w:val="18"/>
+              </w:rPr>
+              <w:t>2025 – 2026</w:t>
+            </w:r>
+          </w:p>
+        </w:tc>
+      </w:tr>
+    </w:tbl>
+    <w:p>
+      <w:pPr>
+        <w:pStyle w:val="ListBullet"/>
+        <w:spacing w:before="0" w:after="20" w:line="252" w:lineRule="auto"/>
+      </w:pPr>
+      <w:r>
+        <w:rPr>
+          <w:rFonts w:ascii="Calibri" w:hAnsi="Calibri"/>
+          <w:sz w:val="18"/>
+        </w:rPr>
+        <w:t>Extracted sliding-window kinetic features on 720k+ IMU records; developed an SVM + few-shot LLM ensemble reaching 96% accuracy and automated clinical narratives.</w:t>
       </w:r>
     </w:p>
     <w:sectPr>
       <w:pgSz w:w="12240" w:h="15840"/>
-      <w:pgMar w:top="792" w:right="936" w:bottom="792" w:left="936" w:header="720" w:footer="720" w:gutter="0"/>
+      <w:pgMar w:top="648" w:right="792" w:bottom="648" w:left="792" w:header="720" w:footer="720" w:gutter="0"/>
       <w:cols w:space="720"/>
       <w:docGrid w:linePitch="360"/>
     </w:sectPr>

</xml_diff>